<commit_message>
sync: README, LICENSE, LICENSES.txt, and Sample-Data from v1.2.2
</commit_message>
<xml_diff>
--- a/Sample-Data/Futures/Walkthrough.docx
+++ b/Sample-Data/Futures/Walkthrough.docx
@@ -38,7 +38,7 @@
           <w:sz w:val="26"/>
           <w:szCs w:val="26"/>
         </w:rPr>
-        <w:t>Deck Manager — v1.1.0</w:t>
+        <w:t>Deck Manager — v1.2.0</w:t>
       </w:r>
     </w:p>
     <w:p>
@@ -2300,39 +2300,11 @@
 <w:hdr xmlns:o="urn:schemas-microsoft-com:office:office" xmlns:r="http://schemas.openxmlformats.org/officeDocument/2006/relationships" xmlns:v="urn:schemas-microsoft-com:vml" xmlns:w="http://schemas.openxmlformats.org/wordprocessingml/2006/main" xmlns:w10="urn:schemas-microsoft-com:office:word" xmlns:wp="http://schemas.openxmlformats.org/drawingml/2006/wordprocessingDrawing" xmlns:pic="http://schemas.openxmlformats.org/drawingml/2006/picture" xmlns:wps="http://schemas.microsoft.com/office/word/2010/wordprocessingShape" xmlns:wpg="http://schemas.microsoft.com/office/word/2010/wordprocessingGroup" xmlns:mc="http://schemas.openxmlformats.org/markup-compatibility/2006" xmlns:wp14="http://schemas.microsoft.com/office/word/2010/wordprocessingDrawing" xmlns:w14="http://schemas.microsoft.com/office/word/2010/wordml" xmlns:w15="http://schemas.microsoft.com/office/word/2012/wordml" mc:Ignorable="w14 wp14 w15">
   <w:p>
     <w:pPr>
-      <w:pStyle w:val="Normal"/>
-      <w:pBdr>
-        <w:bottom w:val="single" w:sz="2" w:space="4" w:color="CCCCCC"/>
-      </w:pBdr>
-      <w:tabs>
-        <w:tab w:val="clear" w:pos="720"/>
-        <w:tab w:val="right" w:pos="9026" w:leader="none"/>
-      </w:tabs>
+      <w:pStyle w:val="Header"/>
       <w:rPr/>
     </w:pPr>
     <w:r>
-      <w:rPr>
-        <w:rFonts w:eastAsia="Arial" w:cs="Arial"/>
-        <w:color w:val="595959"/>
-        <w:sz w:val="18"/>
-        <w:szCs w:val="18"/>
-      </w:rPr>
-      <w:t>Deck Manager — Futures Knoxville Walkthrough</w:t>
-    </w:r>
-    <w:r>
-      <w:rPr>
-        <w:rFonts w:eastAsia="Arial" w:cs="Arial"/>
-      </w:rPr>
-      <w:tab/>
-    </w:r>
-    <w:r>
-      <w:rPr>
-        <w:rFonts w:eastAsia="Arial" w:cs="Arial"/>
-        <w:color w:val="595959"/>
-        <w:sz w:val="18"/>
-        <w:szCs w:val="18"/>
-      </w:rPr>
-      <w:t>v1.1.0</w:t>
+      <w:rPr/>
     </w:r>
   </w:p>
 </w:hdr>
@@ -2342,39 +2314,11 @@
 <w:hdr xmlns:o="urn:schemas-microsoft-com:office:office" xmlns:r="http://schemas.openxmlformats.org/officeDocument/2006/relationships" xmlns:v="urn:schemas-microsoft-com:vml" xmlns:w="http://schemas.openxmlformats.org/wordprocessingml/2006/main" xmlns:w10="urn:schemas-microsoft-com:office:word" xmlns:wp="http://schemas.openxmlformats.org/drawingml/2006/wordprocessingDrawing" xmlns:pic="http://schemas.openxmlformats.org/drawingml/2006/picture" xmlns:wps="http://schemas.microsoft.com/office/word/2010/wordprocessingShape" xmlns:wpg="http://schemas.microsoft.com/office/word/2010/wordprocessingGroup" xmlns:mc="http://schemas.openxmlformats.org/markup-compatibility/2006" xmlns:wp14="http://schemas.microsoft.com/office/word/2010/wordprocessingDrawing" xmlns:w14="http://schemas.microsoft.com/office/word/2010/wordml" xmlns:w15="http://schemas.microsoft.com/office/word/2012/wordml" mc:Ignorable="w14 wp14 w15">
   <w:p>
     <w:pPr>
-      <w:pStyle w:val="Normal"/>
-      <w:pBdr>
-        <w:bottom w:val="single" w:sz="2" w:space="4" w:color="CCCCCC"/>
-      </w:pBdr>
-      <w:tabs>
-        <w:tab w:val="clear" w:pos="720"/>
-        <w:tab w:val="right" w:pos="9026" w:leader="none"/>
-      </w:tabs>
+      <w:pStyle w:val="Header"/>
       <w:rPr/>
     </w:pPr>
     <w:r>
-      <w:rPr>
-        <w:rFonts w:eastAsia="Arial" w:cs="Arial"/>
-        <w:color w:val="595959"/>
-        <w:sz w:val="18"/>
-        <w:szCs w:val="18"/>
-      </w:rPr>
-      <w:t>Deck Manager — Futures Knoxville Walkthrough</w:t>
-    </w:r>
-    <w:r>
-      <w:rPr>
-        <w:rFonts w:eastAsia="Arial" w:cs="Arial"/>
-      </w:rPr>
-      <w:tab/>
-    </w:r>
-    <w:r>
-      <w:rPr>
-        <w:rFonts w:eastAsia="Arial" w:cs="Arial"/>
-        <w:color w:val="595959"/>
-        <w:sz w:val="18"/>
-        <w:szCs w:val="18"/>
-      </w:rPr>
-      <w:t>v1.1.0</w:t>
+      <w:rPr/>
     </w:r>
   </w:p>
 </w:hdr>

</xml_diff>